<commit_message>
Paper v5: final files with metadata removed
Co-Authored-By: Claude Opus 5.5 <noreply@anthropic.com>
</commit_message>
<xml_diff>
--- a/paper/verified-self-training-qwen3-1.7b.docx
+++ b/paper/verified-self-training-qwen3-1.7b.docx
@@ -17043,31 +17043,31 @@
       </w:rPr>
     </w:lvl>
   </w:abstractNum>
-  <w:num w:numId="1" w16cid:durableId="104233152">
+  <w:num w:numId="1">
     <w:abstractNumId w:val="8"/>
   </w:num>
-  <w:num w:numId="2" w16cid:durableId="2115514736">
+  <w:num w:numId="2">
     <w:abstractNumId w:val="6"/>
   </w:num>
-  <w:num w:numId="3" w16cid:durableId="339157976">
+  <w:num w:numId="3">
     <w:abstractNumId w:val="5"/>
   </w:num>
-  <w:num w:numId="4" w16cid:durableId="1382559073">
+  <w:num w:numId="4">
     <w:abstractNumId w:val="4"/>
   </w:num>
-  <w:num w:numId="5" w16cid:durableId="293607996">
+  <w:num w:numId="5">
     <w:abstractNumId w:val="7"/>
   </w:num>
-  <w:num w:numId="6" w16cid:durableId="642808530">
+  <w:num w:numId="6">
     <w:abstractNumId w:val="3"/>
   </w:num>
-  <w:num w:numId="7" w16cid:durableId="1661038395">
+  <w:num w:numId="7">
     <w:abstractNumId w:val="2"/>
   </w:num>
-  <w:num w:numId="8" w16cid:durableId="795370876">
+  <w:num w:numId="8">
     <w:abstractNumId w:val="1"/>
   </w:num>
-  <w:num w:numId="9" w16cid:durableId="1957373993">
+  <w:num w:numId="9">
     <w:abstractNumId w:val="0"/>
   </w:num>
 </w:numbering>

</xml_diff>